<commit_message>
Nova verssão - SEGAC
</commit_message>
<xml_diff>
--- a/public/Adriana_Modelo_Oficio_Placeholders.docx
+++ b/public/Adriana_Modelo_Oficio_Placeholders.docx
@@ -30,7 +30,6 @@
         </w:rPr>
         <w:t>[[</w:t>
       </w:r>
-      <w:proofErr w:type="spellStart"/>
       <w:proofErr w:type="gramStart"/>
       <w:r>
         <w:rPr>
@@ -52,7 +51,6 @@
         </w:rPr>
         <w:t>numero</w:t>
       </w:r>
-      <w:proofErr w:type="spellEnd"/>
       <w:proofErr w:type="gramEnd"/>
       <w:r>
         <w:rPr>
@@ -102,7 +100,6 @@
         </w:rPr>
         <w:t>[[</w:t>
       </w:r>
-      <w:proofErr w:type="spellStart"/>
       <w:r>
         <w:rPr>
           <w:bCs/>
@@ -116,7 +113,6 @@
         </w:rPr>
         <w:t>oficio</w:t>
       </w:r>
-      <w:proofErr w:type="spellEnd"/>
       <w:proofErr w:type="gramEnd"/>
       <w:r>
         <w:rPr>
@@ -313,14 +309,12 @@
         </w:rPr>
         <w:t>[[</w:t>
       </w:r>
-      <w:proofErr w:type="spellStart"/>
       <w:r>
         <w:rPr>
           <w:bCs/>
         </w:rPr>
         <w:t>processo_sei</w:t>
       </w:r>
-      <w:proofErr w:type="spellEnd"/>
       <w:r>
         <w:rPr>
           <w:bCs/>
@@ -387,16 +381,9 @@
       <w:r>
         <w:t>[[</w:t>
       </w:r>
-      <w:proofErr w:type="spellStart"/>
-      <w:r>
-        <w:t>texto_</w:t>
-      </w:r>
-      <w:proofErr w:type="gramStart"/>
-      <w:r>
-        <w:t>oficio</w:t>
-      </w:r>
-      <w:proofErr w:type="spellEnd"/>
-      <w:proofErr w:type="gramEnd"/>
+      <w:r>
+        <w:t>texto_oficio</w:t>
+      </w:r>
       <w:r>
         <w:t>]]</w:t>
       </w:r>
@@ -416,7 +403,13 @@
         <w:jc w:val="both"/>
       </w:pPr>
       <w:r>
-        <w:t>No anseio de vossa atenção, firmamos a presente.</w:t>
+        <w:t xml:space="preserve">No anseio de vossa atenção, firmamos </w:t>
+      </w:r>
+      <w:r>
+        <w:t>o</w:t>
+      </w:r>
+      <w:r>
+        <w:t xml:space="preserve"> presente.</w:t>
       </w:r>
     </w:p>
     <w:p>
@@ -429,6 +422,9 @@
         <w:jc w:val="both"/>
       </w:pPr>
       <w:r>
+        <w:rPr>
+          <w:noProof/>
+        </w:rPr>
         <w:drawing>
           <wp:anchor distT="0" distB="0" distL="114300" distR="114300" simplePos="0" relativeHeight="251658240" behindDoc="1" locked="0" layoutInCell="1" allowOverlap="1" wp14:anchorId="75D2952B" wp14:editId="4D4D0566">
             <wp:simplePos x="0" y="0"/>
@@ -524,30 +520,20 @@
         <w:rPr>
           <w:b/>
         </w:rPr>
-        <w:t xml:space="preserve">ana </w:t>
-      </w:r>
-      <w:proofErr w:type="spellStart"/>
+        <w:t>ana Akemi</w:t>
+      </w:r>
       <w:r>
         <w:rPr>
           <w:b/>
         </w:rPr>
-        <w:t>Akemi</w:t>
-      </w:r>
-      <w:proofErr w:type="spellEnd"/>
+        <w:t xml:space="preserve"> </w:t>
+      </w:r>
       <w:r>
         <w:rPr>
           <w:b/>
         </w:rPr>
-        <w:t xml:space="preserve"> </w:t>
-      </w:r>
-      <w:proofErr w:type="spellStart"/>
-      <w:r>
-        <w:rPr>
-          <w:b/>
-        </w:rPr>
         <w:t>Kuniy</w:t>
       </w:r>
-      <w:proofErr w:type="spellEnd"/>
     </w:p>
     <w:p>
       <w:r>
@@ -3325,6 +3311,7 @@
   <w:style w:type="character" w:default="1" w:styleId="Fontepargpadro">
     <w:name w:val="Default Paragraph Font"/>
     <w:uiPriority w:val="1"/>
+    <w:semiHidden/>
     <w:unhideWhenUsed/>
   </w:style>
   <w:style w:type="table" w:default="1" w:styleId="Tabelanormal">
@@ -3884,18 +3871,18 @@
 </file>
 
 <file path=customXml/item1.xml><?xml version="1.0" encoding="utf-8"?>
-<p:properties xmlns:p="http://schemas.microsoft.com/office/2006/metadata/properties" xmlns:xsi="http://www.w3.org/2001/XMLSchema-instance" xmlns:pc="http://schemas.microsoft.com/office/infopath/2007/PartnerControls">
-  <documentManagement/>
-</p:properties>
-</file>
-
-<file path=customXml/item2.xml><?xml version="1.0" encoding="utf-8"?>
 <?mso-contentType ?>
 <FormTemplates xmlns="http://schemas.microsoft.com/sharepoint/v3/contenttype/forms">
   <Display>DocumentLibraryForm</Display>
   <Edit>DocumentLibraryForm</Edit>
   <New>DocumentLibraryForm</New>
 </FormTemplates>
+</file>
+
+<file path=customXml/item2.xml><?xml version="1.0" encoding="utf-8"?>
+<p:properties xmlns:p="http://schemas.microsoft.com/office/2006/metadata/properties" xmlns:xsi="http://www.w3.org/2001/XMLSchema-instance" xmlns:pc="http://schemas.microsoft.com/office/infopath/2007/PartnerControls">
+  <documentManagement/>
+</p:properties>
 </file>
 
 <file path=customXml/item3.xml><?xml version="1.0" encoding="utf-8"?>
@@ -4037,18 +4024,18 @@
 </file>
 
 <file path=customXml/itemProps1.xml><?xml version="1.0" encoding="utf-8"?>
-<ds:datastoreItem xmlns:ds="http://schemas.openxmlformats.org/officeDocument/2006/customXml" ds:itemID="{3A9EA4BE-E3B6-49A8-A8A7-D32E618C1B96}">
+<ds:datastoreItem xmlns:ds="http://schemas.openxmlformats.org/officeDocument/2006/customXml" ds:itemID="{15487310-0DAD-4EC5-8B46-2B5D03BA84E1}">
   <ds:schemaRefs>
-    <ds:schemaRef ds:uri="http://schemas.microsoft.com/office/2006/metadata/properties"/>
-    <ds:schemaRef ds:uri="http://schemas.microsoft.com/office/infopath/2007/PartnerControls"/>
+    <ds:schemaRef ds:uri="http://schemas.microsoft.com/sharepoint/v3/contenttype/forms"/>
   </ds:schemaRefs>
 </ds:datastoreItem>
 </file>
 
 <file path=customXml/itemProps2.xml><?xml version="1.0" encoding="utf-8"?>
-<ds:datastoreItem xmlns:ds="http://schemas.openxmlformats.org/officeDocument/2006/customXml" ds:itemID="{15487310-0DAD-4EC5-8B46-2B5D03BA84E1}">
+<ds:datastoreItem xmlns:ds="http://schemas.openxmlformats.org/officeDocument/2006/customXml" ds:itemID="{3A9EA4BE-E3B6-49A8-A8A7-D32E618C1B96}">
   <ds:schemaRefs>
-    <ds:schemaRef ds:uri="http://schemas.microsoft.com/sharepoint/v3/contenttype/forms"/>
+    <ds:schemaRef ds:uri="http://schemas.microsoft.com/office/2006/metadata/properties"/>
+    <ds:schemaRef ds:uri="http://schemas.microsoft.com/office/infopath/2007/PartnerControls"/>
   </ds:schemaRefs>
 </ds:datastoreItem>
 </file>

</xml_diff>